<commit_message>
feat: tabela de equipamentos dinamica no DOCX, novo padrao de nome de arquivo e remocao de token recaptcha no email
</commit_message>
<xml_diff>
--- a/template_checklist_tef.docx
+++ b/template_checklist_tef.docx
@@ -1161,257 +1161,7 @@
           </ns0:p>
         </ns0:tc>
       </ns0:tr>
-      <ns0:tr ns2:paraId="6248D883">
-        <ns0:tblPrEx>
-          <ns0:tblBorders>
-            <ns0:top ns0:val="single" ns0:color="auto" ns0:sz="4" ns0:space="0"/>
-            <ns0:left ns0:val="single" ns0:color="auto" ns0:sz="4" ns0:space="0"/>
-            <ns0:bottom ns0:val="single" ns0:color="auto" ns0:sz="4" ns0:space="0"/>
-            <ns0:right ns0:val="single" ns0:color="auto" ns0:sz="4" ns0:space="0"/>
-            <ns0:insideH ns0:val="single" ns0:color="auto" ns0:sz="4" ns0:space="0"/>
-            <ns0:insideV ns0:val="single" ns0:color="auto" ns0:sz="4" ns0:space="0"/>
-          </ns0:tblBorders>
-          <ns0:tblCellMar>
-            <ns0:top ns0:w="0" ns0:type="dxa"/>
-            <ns0:left ns0:w="108" ns0:type="dxa"/>
-            <ns0:bottom ns0:w="0" ns0:type="dxa"/>
-            <ns0:right ns0:w="108" ns0:type="dxa"/>
-          </ns0:tblCellMar>
-        </ns0:tblPrEx>
-        <ns0:trPr>
-          <ns0:trHeight ns0:val="207" ns0:hRule="atLeast"/>
-        </ns0:trPr>
-        <ns0:tc>
-          <ns0:tcPr>
-            <ns0:tcW ns0:w="3113" ns0:type="dxa"/>
-          </ns0:tcPr>
-          <ns0:p ns2:paraId="1F347174">
-            <ns0:pPr>
-              <ns0:pStyle ns0:val="14"/>
-              <ns0:rPr>
-                <ns0:rFonts ns0:hint="default" ns0:ascii="Arial" ns0:hAnsi="Arial" ns0:cs="Arial"/>
-                <ns0:sz ns0:val="20"/>
-                <ns0:szCs ns0:val="20"/>
-                <ns0:lang ns0:val="pt-BR"/>
-              </ns0:rPr>
-            </ns0:pPr>
-            <ns0:r>
-              <ns0:rPr>
-                <ns0:rFonts ns0:hint="default" ns0:ascii="Arial" ns0:hAnsi="Arial" ns0:cs="Arial"/>
-                <ns0:sz ns0:val="20"/>
-                <ns0:szCs ns0:val="20"/>
-                <ns0:lang ns0:val="pt-BR"/>
-              </ns0:rPr>
-              <ns0:t>{{ADQ_1}}</ns0:t>
-            </ns0:r>
-          </ns0:p>
-        </ns0:tc>
-        <ns0:tc>
-          <ns0:tcPr>
-            <ns0:tcW ns0:w="2549" ns0:type="dxa"/>
-          </ns0:tcPr>
-          <ns0:p ns2:paraId="60CD1A79">
-            <ns0:pPr>
-              <ns0:pStyle ns0:val="14"/>
-              <ns0:rPr>
-                <ns0:rFonts ns0:ascii="Arial" ns0:hAnsi="Arial" ns0:cs="Arial"/>
-                <ns0:sz ns0:val="20"/>
-                <ns0:szCs ns0:val="20"/>
-              </ns0:rPr>
-            </ns0:pPr>
-            <ns0:r>
-              <ns0:rPr>
-                <ns0:rFonts ns0:hint="default" ns0:ascii="Arial" ns0:hAnsi="Arial" ns0:cs="Arial"/>
-                <ns0:sz ns0:val="20"/>
-                <ns0:szCs ns0:val="20"/>
-              </ns0:rPr>
-              <ns0:t>{{AFIL_1}}</ns0:t>
-            </ns0:r>
-          </ns0:p>
-        </ns0:tc>
-        <ns0:tc>
-          <ns0:tcPr>
-            <ns0:tcW ns0:w="2832" ns0:type="dxa"/>
-          </ns0:tcPr>
-          <ns0:p ns2:paraId="377D7045">
-            <ns0:pPr>
-              <ns0:pStyle ns0:val="14"/>
-              <ns0:rPr>
-                <ns0:rFonts ns0:ascii="Arial" ns0:hAnsi="Arial" ns0:cs="Arial"/>
-                <ns0:sz ns0:val="20"/>
-                <ns0:szCs ns0:val="20"/>
-              </ns0:rPr>
-            </ns0:pPr>
-            <ns0:r>
-              <ns0:rPr>
-                <ns0:rFonts ns0:ascii="SimSun" ns0:hAnsi="SimSun" ns0:eastAsia="SimSun" ns0:cs="SimSun"/>
-                <ns0:sz ns0:val="24"/>
-                <ns0:szCs ns0:val="24"/>
-              </ns0:rPr>
-              <ns0:t>{{LOG_1}}</ns0:t>
-            </ns0:r>
-          </ns0:p>
-        </ns0:tc>
-      </ns0:tr>
-      <ns0:tr ns2:paraId="1AF30AC7">
-        <ns0:tblPrEx>
-          <ns0:tblBorders>
-            <ns0:top ns0:val="single" ns0:color="auto" ns0:sz="4" ns0:space="0"/>
-            <ns0:left ns0:val="single" ns0:color="auto" ns0:sz="4" ns0:space="0"/>
-            <ns0:bottom ns0:val="single" ns0:color="auto" ns0:sz="4" ns0:space="0"/>
-            <ns0:right ns0:val="single" ns0:color="auto" ns0:sz="4" ns0:space="0"/>
-            <ns0:insideH ns0:val="single" ns0:color="auto" ns0:sz="4" ns0:space="0"/>
-            <ns0:insideV ns0:val="single" ns0:color="auto" ns0:sz="4" ns0:space="0"/>
-          </ns0:tblBorders>
-          <ns0:tblCellMar>
-            <ns0:top ns0:w="0" ns0:type="dxa"/>
-            <ns0:left ns0:w="108" ns0:type="dxa"/>
-            <ns0:bottom ns0:w="0" ns0:type="dxa"/>
-            <ns0:right ns0:w="108" ns0:type="dxa"/>
-          </ns0:tblCellMar>
-        </ns0:tblPrEx>
-        <ns0:trPr>
-          <ns0:trHeight ns0:val="300" ns0:hRule="atLeast"/>
-        </ns0:trPr>
-        <ns0:tc>
-          <ns0:tcPr>
-            <ns0:tcW ns0:w="3113" ns0:type="dxa"/>
-          </ns0:tcPr>
-          <ns0:p ns2:paraId="1FA70471">
-            <ns0:pPr>
-              <ns0:pStyle ns0:val="14"/>
-              <ns0:rPr>
-                <ns0:rFonts ns0:ascii="Arial" ns0:hAnsi="Arial" ns0:cs="Arial"/>
-                <ns0:sz ns0:val="20"/>
-                <ns0:szCs ns0:val="20"/>
-              </ns0:rPr>
-            </ns0:pPr>
-            <ns0:r>
-              <ns0:t>{{ADQ_2}}</ns0:t>
-            </ns0:r>
-          </ns0:p>
-        </ns0:tc>
-        <ns0:tc>
-          <ns0:tcPr>
-            <ns0:tcW ns0:w="2549" ns0:type="dxa"/>
-          </ns0:tcPr>
-          <ns0:p ns2:paraId="65621746">
-            <ns0:pPr>
-              <ns0:pStyle ns0:val="14"/>
-              <ns0:rPr>
-                <ns0:rFonts ns0:ascii="Arial" ns0:hAnsi="Arial" ns0:cs="Arial"/>
-                <ns0:sz ns0:val="20"/>
-                <ns0:szCs ns0:val="20"/>
-              </ns0:rPr>
-            </ns0:pPr>
-            <ns0:r>
-              <ns0:t>{{AFIL_2}}</ns0:t>
-            </ns0:r>
-          </ns0:p>
-        </ns0:tc>
-        <ns0:tc>
-          <ns0:tcPr>
-            <ns0:tcW ns0:w="2832" ns0:type="dxa"/>
-          </ns0:tcPr>
-          <ns0:p ns2:paraId="7F23C96B">
-            <ns0:pPr>
-              <ns0:pStyle ns0:val="14"/>
-              <ns0:rPr>
-                <ns0:rFonts ns0:ascii="Arial" ns0:hAnsi="Arial" ns0:cs="Arial"/>
-                <ns0:sz ns0:val="20"/>
-                <ns0:szCs ns0:val="20"/>
-              </ns0:rPr>
-            </ns0:pPr>
-            <ns0:r>
-              <ns0:t>{{LOG_2}}</ns0:t>
-            </ns0:r>
-          </ns0:p>
-        </ns0:tc>
-      </ns0:tr>
-      <ns0:tr ns2:paraId="5EF97CEB">
-        <ns0:tblPrEx>
-          <ns0:tblBorders>
-            <ns0:top ns0:val="single" ns0:color="auto" ns0:sz="4" ns0:space="0"/>
-            <ns0:left ns0:val="single" ns0:color="auto" ns0:sz="4" ns0:space="0"/>
-            <ns0:bottom ns0:val="single" ns0:color="auto" ns0:sz="4" ns0:space="0"/>
-            <ns0:right ns0:val="single" ns0:color="auto" ns0:sz="4" ns0:space="0"/>
-            <ns0:insideH ns0:val="single" ns0:color="auto" ns0:sz="4" ns0:space="0"/>
-            <ns0:insideV ns0:val="single" ns0:color="auto" ns0:sz="4" ns0:space="0"/>
-          </ns0:tblBorders>
-          <ns0:tblCellMar>
-            <ns0:top ns0:w="0" ns0:type="dxa"/>
-            <ns0:left ns0:w="108" ns0:type="dxa"/>
-            <ns0:bottom ns0:w="0" ns0:type="dxa"/>
-            <ns0:right ns0:w="108" ns0:type="dxa"/>
-          </ns0:tblCellMar>
-        </ns0:tblPrEx>
-        <ns0:trPr>
-          <ns0:trHeight ns0:val="300" ns0:hRule="atLeast"/>
-        </ns0:trPr>
-        <ns0:tc>
-          <ns0:tcPr>
-            <ns0:tcW ns0:w="3113" ns0:type="dxa"/>
-            <ns0:tcBorders>
-              <ns0:top ns0:val="nil"/>
-            </ns0:tcBorders>
-          </ns0:tcPr>
-          <ns0:p ns2:paraId="78F14656">
-            <ns0:pPr>
-              <ns0:pStyle ns0:val="14"/>
-              <ns0:rPr>
-                <ns0:rFonts ns0:ascii="Arial" ns0:hAnsi="Arial" ns0:cs="Arial"/>
-                <ns0:sz ns0:val="20"/>
-                <ns0:szCs ns0:val="20"/>
-              </ns0:rPr>
-            </ns0:pPr>
-            <ns0:r>
-              <ns0:t>{{ADQ_3}}</ns0:t>
-            </ns0:r>
-          </ns0:p>
-        </ns0:tc>
-        <ns0:tc>
-          <ns0:tcPr>
-            <ns0:tcW ns0:w="2549" ns0:type="dxa"/>
-            <ns0:tcBorders>
-              <ns0:top ns0:val="nil"/>
-            </ns0:tcBorders>
-          </ns0:tcPr>
-          <ns0:p ns2:paraId="5B244D79">
-            <ns0:pPr>
-              <ns0:pStyle ns0:val="14"/>
-              <ns0:rPr>
-                <ns0:rFonts ns0:ascii="Arial" ns0:hAnsi="Arial" ns0:cs="Arial"/>
-                <ns0:sz ns0:val="20"/>
-                <ns0:szCs ns0:val="20"/>
-              </ns0:rPr>
-            </ns0:pPr>
-            <ns0:r>
-              <ns0:t>{{AFIL_3}}</ns0:t>
-            </ns0:r>
-          </ns0:p>
-        </ns0:tc>
-        <ns0:tc>
-          <ns0:tcPr>
-            <ns0:tcW ns0:w="2832" ns0:type="dxa"/>
-            <ns0:tcBorders>
-              <ns0:top ns0:val="nil"/>
-            </ns0:tcBorders>
-          </ns0:tcPr>
-          <ns0:p ns2:paraId="1ABCFB18">
-            <ns0:pPr>
-              <ns0:pStyle ns0:val="14"/>
-              <ns0:rPr>
-                <ns0:rFonts ns0:ascii="Arial" ns0:hAnsi="Arial" ns0:cs="Arial"/>
-                <ns0:sz ns0:val="20"/>
-                <ns0:szCs ns0:val="20"/>
-              </ns0:rPr>
-            </ns0:pPr>
-            <ns0:r>
-              <ns0:t>{{LOG_3}}</ns0:t>
-            </ns0:r>
-          </ns0:p>
-        </ns0:tc>
-      </ns0:tr>
+      {{LINHAS_TERMINAIS_XML}}
       <ns0:tr ns2:paraId="644BB49D">
         <ns0:tblPrEx>
           <ns0:tblBorders>

</xml_diff>